<commit_message>
Referencia a archivos en principal
</commit_message>
<xml_diff>
--- a/01 Documentación/01.03 Diseño/Requerimientos Funcionales.docx
+++ b/01 Documentación/01.03 Diseño/Requerimientos Funcionales.docx
@@ -416,11 +416,7 @@
           </w:tcPr>
           <w:p>
             <w:r>
-              <w:rPr>
-                <w:sz w:val="20"/>
-                <w:szCs w:val="20"/>
-              </w:rPr>
-              <w:t>RN-01, RN-02, RN-04, RN-08</w:t>
+              <w:t>R1, R2</w:t>
             </w:r>
           </w:p>
         </w:tc>
@@ -536,11 +532,7 @@
           </w:tcPr>
           <w:p>
             <w:r>
-              <w:rPr>
-                <w:sz w:val="20"/>
-                <w:szCs w:val="20"/>
-              </w:rPr>
-              <w:t>RN-03, RN-04, RN-08</w:t>
+              <w:t>R3, R4</w:t>
             </w:r>
           </w:p>
         </w:tc>
@@ -702,7 +694,7 @@
                 <w:sz w:val="20"/>
                 <w:szCs w:val="20"/>
               </w:rPr>
-              <w:t>RN-08, RN-10</w:t>
+              <w:t>R7</w:t>
             </w:r>
           </w:p>
         </w:tc>
@@ -840,11 +832,7 @@
           </w:tcPr>
           <w:p>
             <w:r>
-              <w:rPr>
-                <w:sz w:val="20"/>
-                <w:szCs w:val="20"/>
-              </w:rPr>
-              <w:t>RN-07</w:t>
+              <w:t>R5, R6</w:t>
             </w:r>
           </w:p>
         </w:tc>
@@ -874,17 +862,6 @@
                 <w:lang w:val="es-PE"/>
               </w:rPr>
             </w:pPr>
-            <w:r>
-              <w:rPr>
-                <w:b/>
-                <w:bCs/>
-                <w:color w:val="1F4E79"/>
-                <w:sz w:val="20"/>
-                <w:szCs w:val="20"/>
-                <w:lang w:val="es-PE"/>
-              </w:rPr>
-              <w:t>Módulo de catálogo de residuos</w:t>
-            </w:r>
           </w:p>
         </w:tc>
       </w:tr>
@@ -1021,11 +998,7 @@
           </w:tcPr>
           <w:p>
             <w:r>
-              <w:rPr>
-                <w:sz w:val="20"/>
-                <w:szCs w:val="20"/>
-              </w:rPr>
-              <w:t>RN-11, RN-12</w:t>
+              <w:t>R8, R9</w:t>
             </w:r>
           </w:p>
         </w:tc>
@@ -1163,11 +1136,7 @@
           </w:tcPr>
           <w:p>
             <w:r>
-              <w:rPr>
-                <w:sz w:val="20"/>
-                <w:szCs w:val="20"/>
-              </w:rPr>
-              <w:t>RN-16, RN-17</w:t>
+              <w:t>R10</w:t>
             </w:r>
           </w:p>
         </w:tc>
@@ -1299,15 +1268,7 @@
               <w:right w:w="120" w:type="dxa"/>
             </w:tcMar>
           </w:tcPr>
-          <w:p>
-            <w:r>
-              <w:rPr>
-                <w:sz w:val="20"/>
-                <w:szCs w:val="20"/>
-              </w:rPr>
-              <w:t>RN-17</w:t>
-            </w:r>
-          </w:p>
+          <w:p/>
         </w:tc>
       </w:tr>
       <w:tr>
@@ -1329,42 +1290,7 @@
               <w:right w:w="120" w:type="dxa"/>
             </w:tcMar>
           </w:tcPr>
-          <w:p>
-            <w:proofErr w:type="spellStart"/>
-            <w:r>
-              <w:rPr>
-                <w:b/>
-                <w:bCs/>
-                <w:color w:val="1F4E79"/>
-                <w:sz w:val="20"/>
-                <w:szCs w:val="20"/>
-              </w:rPr>
-              <w:t>Módulo</w:t>
-            </w:r>
-            <w:proofErr w:type="spellEnd"/>
-            <w:r>
-              <w:rPr>
-                <w:b/>
-                <w:bCs/>
-                <w:color w:val="1F4E79"/>
-                <w:sz w:val="20"/>
-                <w:szCs w:val="20"/>
-              </w:rPr>
-              <w:t xml:space="preserve"> de </w:t>
-            </w:r>
-            <w:proofErr w:type="spellStart"/>
-            <w:r>
-              <w:rPr>
-                <w:b/>
-                <w:bCs/>
-                <w:color w:val="1F4E79"/>
-                <w:sz w:val="20"/>
-                <w:szCs w:val="20"/>
-              </w:rPr>
-              <w:t>comunicación</w:t>
-            </w:r>
-            <w:proofErr w:type="spellEnd"/>
-          </w:p>
+          <w:p/>
         </w:tc>
       </w:tr>
       <w:tr>
@@ -1500,11 +1426,7 @@
           </w:tcPr>
           <w:p>
             <w:r>
-              <w:rPr>
-                <w:sz w:val="20"/>
-                <w:szCs w:val="20"/>
-              </w:rPr>
-              <w:t>RN-21, RN-22</w:t>
+              <w:t>R11, R12</w:t>
             </w:r>
           </w:p>
         </w:tc>
@@ -1638,11 +1560,7 @@
           </w:tcPr>
           <w:p>
             <w:r>
-              <w:rPr>
-                <w:sz w:val="20"/>
-                <w:szCs w:val="20"/>
-              </w:rPr>
-              <w:t>RN-24</w:t>
+              <w:t>R13</w:t>
             </w:r>
           </w:p>
         </w:tc>
@@ -1672,18 +1590,6 @@
                 <w:lang w:val="es-PE"/>
               </w:rPr>
             </w:pPr>
-            <w:r>
-              <w:rPr>
-                <w:b/>
-                <w:bCs/>
-                <w:color w:val="1F4E79"/>
-                <w:sz w:val="20"/>
-                <w:szCs w:val="20"/>
-                <w:lang w:val="es-PE"/>
-              </w:rPr>
-              <w:lastRenderedPageBreak/>
-              <w:t>Módulo de transacciones y pagos</w:t>
-            </w:r>
           </w:p>
         </w:tc>
       </w:tr>
@@ -1820,11 +1726,7 @@
           </w:tcPr>
           <w:p>
             <w:r>
-              <w:rPr>
-                <w:sz w:val="20"/>
-                <w:szCs w:val="20"/>
-              </w:rPr>
-              <w:t>RN-26, RN-27</w:t>
+              <w:t>R14, R15</w:t>
             </w:r>
           </w:p>
         </w:tc>
@@ -1947,11 +1849,7 @@
           </w:tcPr>
           <w:p>
             <w:r>
-              <w:rPr>
-                <w:sz w:val="20"/>
-                <w:szCs w:val="20"/>
-              </w:rPr>
-              <w:t>RN-30, RN-31</w:t>
+              <w:t>R16</w:t>
             </w:r>
           </w:p>
         </w:tc>
@@ -2452,51 +2350,43 @@
             </w:tcMar>
           </w:tcPr>
           <w:p>
+            <w:r>
+              <w:rPr>
+                <w:b/>
+                <w:bCs/>
+                <w:sz w:val="20"/>
+                <w:szCs w:val="20"/>
+              </w:rPr>
+              <w:t>RN-05</w:t>
+            </w:r>
+          </w:p>
+        </w:tc>
+        <w:tc>
+          <w:tcPr>
+            <w:tcW w:w="8360" w:type="dxa"/>
+            <w:tcBorders>
+              <w:top w:val="single" w:sz="4" w:space="0" w:color="BFBFBF"/>
+              <w:left w:val="single" w:sz="4" w:space="0" w:color="BFBFBF"/>
+              <w:bottom w:val="single" w:sz="4" w:space="0" w:color="BFBFBF"/>
+              <w:right w:val="single" w:sz="4" w:space="0" w:color="BFBFBF"/>
+            </w:tcBorders>
+            <w:tcMar>
+              <w:top w:w="80" w:type="dxa"/>
+              <w:left w:w="120" w:type="dxa"/>
+              <w:bottom w:w="80" w:type="dxa"/>
+              <w:right w:w="120" w:type="dxa"/>
+            </w:tcMar>
+          </w:tcPr>
+          <w:p>
             <w:pPr>
               <w:rPr>
-                <w:highlight w:val="yellow"/>
+                <w:lang w:val="es-PE"/>
               </w:rPr>
             </w:pPr>
             <w:r>
               <w:rPr>
-                <w:b/>
-                <w:bCs/>
-                <w:sz w:val="20"/>
-                <w:szCs w:val="20"/>
-                <w:highlight w:val="yellow"/>
-              </w:rPr>
-              <w:t>RN-05</w:t>
-            </w:r>
-          </w:p>
-        </w:tc>
-        <w:tc>
-          <w:tcPr>
-            <w:tcW w:w="8360" w:type="dxa"/>
-            <w:tcBorders>
-              <w:top w:val="single" w:sz="4" w:space="0" w:color="BFBFBF"/>
-              <w:left w:val="single" w:sz="4" w:space="0" w:color="BFBFBF"/>
-              <w:bottom w:val="single" w:sz="4" w:space="0" w:color="BFBFBF"/>
-              <w:right w:val="single" w:sz="4" w:space="0" w:color="BFBFBF"/>
-            </w:tcBorders>
-            <w:tcMar>
-              <w:top w:w="80" w:type="dxa"/>
-              <w:left w:w="120" w:type="dxa"/>
-              <w:bottom w:w="80" w:type="dxa"/>
-              <w:right w:w="120" w:type="dxa"/>
-            </w:tcMar>
-          </w:tcPr>
-          <w:p>
-            <w:pPr>
-              <w:rPr>
-                <w:highlight w:val="yellow"/>
-                <w:lang w:val="es-PE"/>
-              </w:rPr>
-            </w:pPr>
-            <w:r>
-              <w:rPr>
-                <w:sz w:val="20"/>
-                <w:szCs w:val="20"/>
-                <w:highlight w:val="yellow"/>
+                <w:sz w:val="20"/>
+                <w:szCs w:val="20"/>
                 <w:lang w:val="es-PE"/>
               </w:rPr>
               <w:t>Después de 5 intentos fallidos consecutivos de inicio de sesión, la cuenta se bloquea temporalmente por 30 minutos.</w:t>
@@ -2870,60 +2760,280 @@
       <w:tr>
         <w:tc>
           <w:tcPr>
-            <w:tcW w:w="1000" w:type="dxa"/>
-            <w:tcBorders>
-              <w:top w:val="single" w:sz="4" w:space="0" w:color="BFBFBF"/>
-              <w:left w:val="single" w:sz="4" w:space="0" w:color="BFBFBF"/>
-              <w:bottom w:val="single" w:sz="4" w:space="0" w:color="BFBFBF"/>
-              <w:right w:val="single" w:sz="4" w:space="0" w:color="BFBFBF"/>
-            </w:tcBorders>
-            <w:tcMar>
-              <w:top w:w="80" w:type="dxa"/>
-              <w:left w:w="120" w:type="dxa"/>
-              <w:bottom w:w="80" w:type="dxa"/>
-              <w:right w:w="120" w:type="dxa"/>
-            </w:tcMar>
-          </w:tcPr>
-          <w:p>
-            <w:r>
-              <w:rPr>
-                <w:b/>
-                <w:bCs/>
-                <w:sz w:val="20"/>
-                <w:szCs w:val="20"/>
-              </w:rPr>
-              <w:t>RN-11</w:t>
-            </w:r>
-          </w:p>
-        </w:tc>
-        <w:tc>
-          <w:tcPr>
-            <w:tcW w:w="8360" w:type="dxa"/>
-            <w:tcBorders>
-              <w:top w:val="single" w:sz="4" w:space="0" w:color="BFBFBF"/>
-              <w:left w:val="single" w:sz="4" w:space="0" w:color="BFBFBF"/>
-              <w:bottom w:val="single" w:sz="4" w:space="0" w:color="BFBFBF"/>
-              <w:right w:val="single" w:sz="4" w:space="0" w:color="BFBFBF"/>
-            </w:tcBorders>
-            <w:tcMar>
-              <w:top w:w="80" w:type="dxa"/>
-              <w:left w:w="120" w:type="dxa"/>
-              <w:bottom w:w="80" w:type="dxa"/>
-              <w:right w:w="120" w:type="dxa"/>
-            </w:tcMar>
-          </w:tcPr>
-          <w:p>
-            <w:pPr>
-              <w:rPr>
-                <w:lang w:val="es-PE"/>
-              </w:rPr>
-            </w:pPr>
+            <w:tcW w:w="9360" w:type="dxa"/>
+            <w:gridSpan w:val="2"/>
+            <w:tcBorders>
+              <w:top w:val="single" w:sz="4" w:space="0" w:color="BFBFBF"/>
+              <w:left w:val="single" w:sz="4" w:space="0" w:color="BFBFBF"/>
+              <w:bottom w:val="single" w:sz="4" w:space="0" w:color="BFBFBF"/>
+              <w:right w:val="single" w:sz="4" w:space="0" w:color="BFBFBF"/>
+            </w:tcBorders>
+            <w:shd w:val="clear" w:color="auto" w:fill="D6E4F0"/>
+            <w:tcMar>
+              <w:top w:w="80" w:type="dxa"/>
+              <w:left w:w="120" w:type="dxa"/>
+              <w:bottom w:w="80" w:type="dxa"/>
+              <w:right w:w="120" w:type="dxa"/>
+            </w:tcMar>
+          </w:tcPr>
+          <w:p>
+            <w:proofErr w:type="spellStart"/>
+            <w:r>
+              <w:rPr>
+                <w:b/>
+                <w:bCs/>
+                <w:color w:val="1F4E79"/>
+                <w:sz w:val="20"/>
+                <w:szCs w:val="20"/>
+              </w:rPr>
+              <w:t>Módulo</w:t>
+            </w:r>
+            <w:proofErr w:type="spellEnd"/>
+            <w:r>
+              <w:rPr>
+                <w:b/>
+                <w:bCs/>
+                <w:color w:val="1F4E79"/>
+                <w:sz w:val="20"/>
+                <w:szCs w:val="20"/>
+              </w:rPr>
+              <w:t xml:space="preserve"> de </w:t>
+            </w:r>
+            <w:proofErr w:type="spellStart"/>
+            <w:r>
+              <w:rPr>
+                <w:b/>
+                <w:bCs/>
+                <w:color w:val="1F4E79"/>
+                <w:sz w:val="20"/>
+                <w:szCs w:val="20"/>
+              </w:rPr>
+              <w:t>comunicación</w:t>
+            </w:r>
+            <w:proofErr w:type="spellEnd"/>
           </w:p>
         </w:tc>
       </w:tr>
       <w:tr>
         <w:tc>
           <w:tcPr>
+            <w:tcW w:w="1000" w:type="dxa"/>
+            <w:tcBorders>
+              <w:top w:val="single" w:sz="4" w:space="0" w:color="BFBFBF"/>
+              <w:left w:val="single" w:sz="4" w:space="0" w:color="BFBFBF"/>
+              <w:bottom w:val="single" w:sz="4" w:space="0" w:color="BFBFBF"/>
+              <w:right w:val="single" w:sz="4" w:space="0" w:color="BFBFBF"/>
+            </w:tcBorders>
+            <w:shd w:val="clear" w:color="auto" w:fill="F2F2F2"/>
+            <w:tcMar>
+              <w:top w:w="80" w:type="dxa"/>
+              <w:left w:w="120" w:type="dxa"/>
+              <w:bottom w:w="80" w:type="dxa"/>
+              <w:right w:w="120" w:type="dxa"/>
+            </w:tcMar>
+          </w:tcPr>
+          <w:p>
+            <w:r>
+              <w:rPr>
+                <w:b/>
+                <w:bCs/>
+                <w:sz w:val="20"/>
+                <w:szCs w:val="20"/>
+              </w:rPr>
+              <w:t>RN-1</w:t>
+            </w:r>
+            <w:r>
+              <w:rPr>
+                <w:b/>
+                <w:bCs/>
+                <w:sz w:val="20"/>
+                <w:szCs w:val="20"/>
+              </w:rPr>
+              <w:t>1</w:t>
+            </w:r>
+          </w:p>
+        </w:tc>
+        <w:tc>
+          <w:tcPr>
+            <w:tcW w:w="8360" w:type="dxa"/>
+            <w:tcBorders>
+              <w:top w:val="single" w:sz="4" w:space="0" w:color="BFBFBF"/>
+              <w:left w:val="single" w:sz="4" w:space="0" w:color="BFBFBF"/>
+              <w:bottom w:val="single" w:sz="4" w:space="0" w:color="BFBFBF"/>
+              <w:right w:val="single" w:sz="4" w:space="0" w:color="BFBFBF"/>
+            </w:tcBorders>
+            <w:shd w:val="clear" w:color="auto" w:fill="F2F2F2"/>
+            <w:tcMar>
+              <w:top w:w="80" w:type="dxa"/>
+              <w:left w:w="120" w:type="dxa"/>
+              <w:bottom w:w="80" w:type="dxa"/>
+              <w:right w:w="120" w:type="dxa"/>
+            </w:tcMar>
+          </w:tcPr>
+          <w:p>
+            <w:pPr>
+              <w:rPr>
+                <w:lang w:val="es-PE"/>
+              </w:rPr>
+            </w:pPr>
+            <w:r>
+              <w:rPr>
+                <w:sz w:val="20"/>
+                <w:szCs w:val="20"/>
+                <w:lang w:val="es-PE"/>
+              </w:rPr>
+              <w:t>Un comprador solo puede iniciar una conversación con un vendedor a través de una publicación activa (estado 'disponible' o 'reservada').</w:t>
+            </w:r>
+          </w:p>
+        </w:tc>
+      </w:tr>
+      <w:tr>
+        <w:tc>
+          <w:tcPr>
+            <w:tcW w:w="1000" w:type="dxa"/>
+            <w:tcBorders>
+              <w:top w:val="single" w:sz="4" w:space="0" w:color="BFBFBF"/>
+              <w:left w:val="single" w:sz="4" w:space="0" w:color="BFBFBF"/>
+              <w:bottom w:val="single" w:sz="4" w:space="0" w:color="BFBFBF"/>
+              <w:right w:val="single" w:sz="4" w:space="0" w:color="BFBFBF"/>
+            </w:tcBorders>
+            <w:tcMar>
+              <w:top w:w="80" w:type="dxa"/>
+              <w:left w:w="120" w:type="dxa"/>
+              <w:bottom w:w="80" w:type="dxa"/>
+              <w:right w:w="120" w:type="dxa"/>
+            </w:tcMar>
+          </w:tcPr>
+          <w:p>
+            <w:r>
+              <w:rPr>
+                <w:b/>
+                <w:bCs/>
+                <w:sz w:val="20"/>
+                <w:szCs w:val="20"/>
+              </w:rPr>
+              <w:t>RN-1</w:t>
+            </w:r>
+            <w:r>
+              <w:rPr>
+                <w:b/>
+                <w:bCs/>
+                <w:sz w:val="20"/>
+                <w:szCs w:val="20"/>
+              </w:rPr>
+              <w:t>2</w:t>
+            </w:r>
+          </w:p>
+        </w:tc>
+        <w:tc>
+          <w:tcPr>
+            <w:tcW w:w="8360" w:type="dxa"/>
+            <w:tcBorders>
+              <w:top w:val="single" w:sz="4" w:space="0" w:color="BFBFBF"/>
+              <w:left w:val="single" w:sz="4" w:space="0" w:color="BFBFBF"/>
+              <w:bottom w:val="single" w:sz="4" w:space="0" w:color="BFBFBF"/>
+              <w:right w:val="single" w:sz="4" w:space="0" w:color="BFBFBF"/>
+            </w:tcBorders>
+            <w:tcMar>
+              <w:top w:w="80" w:type="dxa"/>
+              <w:left w:w="120" w:type="dxa"/>
+              <w:bottom w:w="80" w:type="dxa"/>
+              <w:right w:w="120" w:type="dxa"/>
+            </w:tcMar>
+          </w:tcPr>
+          <w:p>
+            <w:pPr>
+              <w:rPr>
+                <w:lang w:val="es-PE"/>
+              </w:rPr>
+            </w:pPr>
+            <w:r>
+              <w:rPr>
+                <w:sz w:val="20"/>
+                <w:szCs w:val="20"/>
+                <w:lang w:val="es-PE"/>
+              </w:rPr>
+              <w:t>Los mensajes deben tener un máximo de 2,000 caracteres. No se permite el envío de archivos adjuntos por mensajería (solo texto).</w:t>
+            </w:r>
+          </w:p>
+        </w:tc>
+      </w:tr>
+      <w:tr>
+        <w:tc>
+          <w:tcPr>
+            <w:tcW w:w="1000" w:type="dxa"/>
+            <w:tcBorders>
+              <w:top w:val="single" w:sz="4" w:space="0" w:color="BFBFBF"/>
+              <w:left w:val="single" w:sz="4" w:space="0" w:color="BFBFBF"/>
+              <w:bottom w:val="single" w:sz="4" w:space="0" w:color="BFBFBF"/>
+              <w:right w:val="single" w:sz="4" w:space="0" w:color="BFBFBF"/>
+            </w:tcBorders>
+            <w:shd w:val="clear" w:color="auto" w:fill="F2F2F2"/>
+            <w:tcMar>
+              <w:top w:w="80" w:type="dxa"/>
+              <w:left w:w="120" w:type="dxa"/>
+              <w:bottom w:w="80" w:type="dxa"/>
+              <w:right w:w="120" w:type="dxa"/>
+            </w:tcMar>
+          </w:tcPr>
+          <w:p>
+            <w:r>
+              <w:rPr>
+                <w:b/>
+                <w:bCs/>
+                <w:sz w:val="20"/>
+                <w:szCs w:val="20"/>
+              </w:rPr>
+              <w:t>RN-1</w:t>
+            </w:r>
+            <w:r>
+              <w:rPr>
+                <w:b/>
+                <w:bCs/>
+                <w:sz w:val="20"/>
+                <w:szCs w:val="20"/>
+              </w:rPr>
+              <w:t>3</w:t>
+            </w:r>
+          </w:p>
+        </w:tc>
+        <w:tc>
+          <w:tcPr>
+            <w:tcW w:w="8360" w:type="dxa"/>
+            <w:tcBorders>
+              <w:top w:val="single" w:sz="4" w:space="0" w:color="BFBFBF"/>
+              <w:left w:val="single" w:sz="4" w:space="0" w:color="BFBFBF"/>
+              <w:bottom w:val="single" w:sz="4" w:space="0" w:color="BFBFBF"/>
+              <w:right w:val="single" w:sz="4" w:space="0" w:color="BFBFBF"/>
+            </w:tcBorders>
+            <w:shd w:val="clear" w:color="auto" w:fill="F2F2F2"/>
+            <w:tcMar>
+              <w:top w:w="80" w:type="dxa"/>
+              <w:left w:w="120" w:type="dxa"/>
+              <w:bottom w:w="80" w:type="dxa"/>
+              <w:right w:w="120" w:type="dxa"/>
+            </w:tcMar>
+          </w:tcPr>
+          <w:p>
+            <w:pPr>
+              <w:rPr>
+                <w:lang w:val="es-PE"/>
+              </w:rPr>
+            </w:pPr>
+            <w:r>
+              <w:rPr>
+                <w:sz w:val="20"/>
+                <w:szCs w:val="20"/>
+                <w:lang w:val="es-PE"/>
+              </w:rPr>
+              <w:t>Las notificaciones internas se conservan por 60 días. Pasado ese plazo, se eliminan automáticamente.</w:t>
+            </w:r>
+          </w:p>
+        </w:tc>
+      </w:tr>
+      <w:tr>
+        <w:tc>
+          <w:tcPr>
             <w:tcW w:w="9360" w:type="dxa"/>
             <w:gridSpan w:val="2"/>
             <w:tcBorders>
@@ -2941,7 +3051,11 @@
             </w:tcMar>
           </w:tcPr>
           <w:p>
-            <w:proofErr w:type="spellStart"/>
+            <w:pPr>
+              <w:rPr>
+                <w:lang w:val="es-PE"/>
+              </w:rPr>
+            </w:pPr>
             <w:r>
               <w:rPr>
                 <w:b/>
@@ -2949,32 +3063,10 @@
                 <w:color w:val="1F4E79"/>
                 <w:sz w:val="20"/>
                 <w:szCs w:val="20"/>
-              </w:rPr>
-              <w:t>Módulo</w:t>
-            </w:r>
-            <w:proofErr w:type="spellEnd"/>
-            <w:r>
-              <w:rPr>
-                <w:b/>
-                <w:bCs/>
-                <w:color w:val="1F4E79"/>
-                <w:sz w:val="20"/>
-                <w:szCs w:val="20"/>
-              </w:rPr>
-              <w:t xml:space="preserve"> de </w:t>
-            </w:r>
-            <w:proofErr w:type="spellStart"/>
-            <w:r>
-              <w:rPr>
-                <w:b/>
-                <w:bCs/>
-                <w:color w:val="1F4E79"/>
-                <w:sz w:val="20"/>
-                <w:szCs w:val="20"/>
-              </w:rPr>
-              <w:t>comunicación</w:t>
-            </w:r>
-            <w:proofErr w:type="spellEnd"/>
+                <w:lang w:val="es-PE"/>
+              </w:rPr>
+              <w:t>Módulo de transacciones y pagos</w:t>
+            </w:r>
           </w:p>
         </w:tc>
       </w:tr>
@@ -2988,23 +3080,31 @@
               <w:bottom w:val="single" w:sz="4" w:space="0" w:color="BFBFBF"/>
               <w:right w:val="single" w:sz="4" w:space="0" w:color="BFBFBF"/>
             </w:tcBorders>
-            <w:shd w:val="clear" w:color="auto" w:fill="F2F2F2"/>
-            <w:tcMar>
-              <w:top w:w="80" w:type="dxa"/>
-              <w:left w:w="120" w:type="dxa"/>
-              <w:bottom w:w="80" w:type="dxa"/>
-              <w:right w:w="120" w:type="dxa"/>
-            </w:tcMar>
-          </w:tcPr>
-          <w:p>
-            <w:r>
-              <w:rPr>
-                <w:b/>
-                <w:bCs/>
-                <w:sz w:val="20"/>
-                <w:szCs w:val="20"/>
-              </w:rPr>
-              <w:t>RN-12</w:t>
+            <w:tcMar>
+              <w:top w:w="80" w:type="dxa"/>
+              <w:left w:w="120" w:type="dxa"/>
+              <w:bottom w:w="80" w:type="dxa"/>
+              <w:right w:w="120" w:type="dxa"/>
+            </w:tcMar>
+          </w:tcPr>
+          <w:p>
+            <w:r>
+              <w:rPr>
+                <w:b/>
+                <w:bCs/>
+                <w:sz w:val="20"/>
+                <w:szCs w:val="20"/>
+              </w:rPr>
+              <w:t>RN-1</w:t>
+            </w:r>
+            <w:r>
+              <w:rPr>
+                <w:b/>
+                <w:bCs/>
+                <w:sz w:val="20"/>
+                <w:szCs w:val="20"/>
+              </w:rPr>
+              <w:t>4</w:t>
             </w:r>
           </w:p>
         </w:tc>
@@ -3017,7 +3117,6 @@
               <w:bottom w:val="single" w:sz="4" w:space="0" w:color="BFBFBF"/>
               <w:right w:val="single" w:sz="4" w:space="0" w:color="BFBFBF"/>
             </w:tcBorders>
-            <w:shd w:val="clear" w:color="auto" w:fill="F2F2F2"/>
             <w:tcMar>
               <w:top w:w="80" w:type="dxa"/>
               <w:left w:w="120" w:type="dxa"/>
@@ -3037,7 +3136,7 @@
                 <w:szCs w:val="20"/>
                 <w:lang w:val="es-PE"/>
               </w:rPr>
-              <w:t>Un comprador solo puede iniciar una conversación con un vendedor a través de una publicación activa (estado 'disponible' o 'reservada').</w:t>
+              <w:t>Un comprador no puede iniciar una solicitud de compra sobre un material publicado por él mismo.</w:t>
             </w:r>
           </w:p>
         </w:tc>
@@ -3052,22 +3151,32 @@
               <w:bottom w:val="single" w:sz="4" w:space="0" w:color="BFBFBF"/>
               <w:right w:val="single" w:sz="4" w:space="0" w:color="BFBFBF"/>
             </w:tcBorders>
-            <w:tcMar>
-              <w:top w:w="80" w:type="dxa"/>
-              <w:left w:w="120" w:type="dxa"/>
-              <w:bottom w:w="80" w:type="dxa"/>
-              <w:right w:w="120" w:type="dxa"/>
-            </w:tcMar>
-          </w:tcPr>
-          <w:p>
-            <w:r>
-              <w:rPr>
-                <w:b/>
-                <w:bCs/>
-                <w:sz w:val="20"/>
-                <w:szCs w:val="20"/>
-              </w:rPr>
-              <w:t>RN-13</w:t>
+            <w:shd w:val="clear" w:color="auto" w:fill="F2F2F2"/>
+            <w:tcMar>
+              <w:top w:w="80" w:type="dxa"/>
+              <w:left w:w="120" w:type="dxa"/>
+              <w:bottom w:w="80" w:type="dxa"/>
+              <w:right w:w="120" w:type="dxa"/>
+            </w:tcMar>
+          </w:tcPr>
+          <w:p>
+            <w:r>
+              <w:rPr>
+                <w:b/>
+                <w:bCs/>
+                <w:sz w:val="20"/>
+                <w:szCs w:val="20"/>
+              </w:rPr>
+              <w:t>RN-1</w:t>
+            </w:r>
+            <w:r>
+              <w:rPr>
+                <w:b/>
+                <w:bCs/>
+                <w:sz w:val="20"/>
+                <w:szCs w:val="20"/>
+              </w:rPr>
+              <w:t>5</w:t>
             </w:r>
           </w:p>
         </w:tc>
@@ -3080,6 +3189,7 @@
               <w:bottom w:val="single" w:sz="4" w:space="0" w:color="BFBFBF"/>
               <w:right w:val="single" w:sz="4" w:space="0" w:color="BFBFBF"/>
             </w:tcBorders>
+            <w:shd w:val="clear" w:color="auto" w:fill="F2F2F2"/>
             <w:tcMar>
               <w:top w:w="80" w:type="dxa"/>
               <w:left w:w="120" w:type="dxa"/>
@@ -3095,11 +3205,9 @@
             </w:pPr>
             <w:r>
               <w:rPr>
-                <w:sz w:val="20"/>
-                <w:szCs w:val="20"/>
-                <w:lang w:val="es-PE"/>
-              </w:rPr>
-              <w:t>Los mensajes deben tener un máximo de 2,000 caracteres. No se permite el envío de archivos adjuntos por mensajería (solo texto).</w:t>
+                <w:lang w:val="es-PE"/>
+              </w:rPr>
+              <w:t>Un comprador solo puede mantener una solicitud de compra activa por cada publicación. Mientras exista una solicitud con estado Pendiente o Aceptada, el sistema no permitirá registrar una nueva solicitud para la misma publicación.</w:t>
             </w:r>
           </w:p>
         </w:tc>
@@ -3114,278 +3222,31 @@
               <w:bottom w:val="single" w:sz="4" w:space="0" w:color="BFBFBF"/>
               <w:right w:val="single" w:sz="4" w:space="0" w:color="BFBFBF"/>
             </w:tcBorders>
-            <w:shd w:val="clear" w:color="auto" w:fill="F2F2F2"/>
-            <w:tcMar>
-              <w:top w:w="80" w:type="dxa"/>
-              <w:left w:w="120" w:type="dxa"/>
-              <w:bottom w:w="80" w:type="dxa"/>
-              <w:right w:w="120" w:type="dxa"/>
-            </w:tcMar>
-          </w:tcPr>
-          <w:p>
-            <w:r>
-              <w:rPr>
-                <w:b/>
-                <w:bCs/>
-                <w:sz w:val="20"/>
-                <w:szCs w:val="20"/>
-              </w:rPr>
-              <w:t>RN-14</w:t>
-            </w:r>
-          </w:p>
-        </w:tc>
-        <w:tc>
-          <w:tcPr>
-            <w:tcW w:w="8360" w:type="dxa"/>
-            <w:tcBorders>
-              <w:top w:val="single" w:sz="4" w:space="0" w:color="BFBFBF"/>
-              <w:left w:val="single" w:sz="4" w:space="0" w:color="BFBFBF"/>
-              <w:bottom w:val="single" w:sz="4" w:space="0" w:color="BFBFBF"/>
-              <w:right w:val="single" w:sz="4" w:space="0" w:color="BFBFBF"/>
-            </w:tcBorders>
-            <w:shd w:val="clear" w:color="auto" w:fill="F2F2F2"/>
-            <w:tcMar>
-              <w:top w:w="80" w:type="dxa"/>
-              <w:left w:w="120" w:type="dxa"/>
-              <w:bottom w:w="80" w:type="dxa"/>
-              <w:right w:w="120" w:type="dxa"/>
-            </w:tcMar>
-          </w:tcPr>
-          <w:p>
-            <w:pPr>
-              <w:rPr>
-                <w:lang w:val="es-PE"/>
-              </w:rPr>
-            </w:pPr>
-            <w:r>
-              <w:rPr>
-                <w:sz w:val="20"/>
-                <w:szCs w:val="20"/>
-                <w:lang w:val="es-PE"/>
-              </w:rPr>
-              <w:t>Las notificaciones internas se conservan por 60 días. Pasado ese plazo, se eliminan automáticamente.</w:t>
-            </w:r>
-          </w:p>
-        </w:tc>
-      </w:tr>
-      <w:tr>
-        <w:tc>
-          <w:tcPr>
-            <w:tcW w:w="9360" w:type="dxa"/>
-            <w:gridSpan w:val="2"/>
-            <w:tcBorders>
-              <w:top w:val="single" w:sz="4" w:space="0" w:color="BFBFBF"/>
-              <w:left w:val="single" w:sz="4" w:space="0" w:color="BFBFBF"/>
-              <w:bottom w:val="single" w:sz="4" w:space="0" w:color="BFBFBF"/>
-              <w:right w:val="single" w:sz="4" w:space="0" w:color="BFBFBF"/>
-            </w:tcBorders>
-            <w:shd w:val="clear" w:color="auto" w:fill="D6E4F0"/>
-            <w:tcMar>
-              <w:top w:w="80" w:type="dxa"/>
-              <w:left w:w="120" w:type="dxa"/>
-              <w:bottom w:w="80" w:type="dxa"/>
-              <w:right w:w="120" w:type="dxa"/>
-            </w:tcMar>
-          </w:tcPr>
-          <w:p>
-            <w:pPr>
-              <w:rPr>
-                <w:lang w:val="es-PE"/>
-              </w:rPr>
-            </w:pPr>
-            <w:r>
-              <w:rPr>
-                <w:b/>
-                <w:bCs/>
-                <w:color w:val="1F4E79"/>
-                <w:sz w:val="20"/>
-                <w:szCs w:val="20"/>
-                <w:lang w:val="es-PE"/>
-              </w:rPr>
-              <w:t>Módulo de transacciones y pagos</w:t>
-            </w:r>
-          </w:p>
-        </w:tc>
-      </w:tr>
-      <w:tr>
-        <w:tc>
-          <w:tcPr>
-            <w:tcW w:w="1000" w:type="dxa"/>
-            <w:tcBorders>
-              <w:top w:val="single" w:sz="4" w:space="0" w:color="BFBFBF"/>
-              <w:left w:val="single" w:sz="4" w:space="0" w:color="BFBFBF"/>
-              <w:bottom w:val="single" w:sz="4" w:space="0" w:color="BFBFBF"/>
-              <w:right w:val="single" w:sz="4" w:space="0" w:color="BFBFBF"/>
-            </w:tcBorders>
-            <w:tcMar>
-              <w:top w:w="80" w:type="dxa"/>
-              <w:left w:w="120" w:type="dxa"/>
-              <w:bottom w:w="80" w:type="dxa"/>
-              <w:right w:w="120" w:type="dxa"/>
-            </w:tcMar>
-          </w:tcPr>
-          <w:p>
-            <w:r>
-              <w:rPr>
-                <w:b/>
-                <w:bCs/>
-                <w:sz w:val="20"/>
-                <w:szCs w:val="20"/>
-              </w:rPr>
-              <w:t>RN-15</w:t>
-            </w:r>
-          </w:p>
-        </w:tc>
-        <w:tc>
-          <w:tcPr>
-            <w:tcW w:w="8360" w:type="dxa"/>
-            <w:tcBorders>
-              <w:top w:val="single" w:sz="4" w:space="0" w:color="BFBFBF"/>
-              <w:left w:val="single" w:sz="4" w:space="0" w:color="BFBFBF"/>
-              <w:bottom w:val="single" w:sz="4" w:space="0" w:color="BFBFBF"/>
-              <w:right w:val="single" w:sz="4" w:space="0" w:color="BFBFBF"/>
-            </w:tcBorders>
-            <w:tcMar>
-              <w:top w:w="80" w:type="dxa"/>
-              <w:left w:w="120" w:type="dxa"/>
-              <w:bottom w:w="80" w:type="dxa"/>
-              <w:right w:w="120" w:type="dxa"/>
-            </w:tcMar>
-          </w:tcPr>
-          <w:p>
-            <w:pPr>
-              <w:rPr>
-                <w:lang w:val="es-PE"/>
-              </w:rPr>
-            </w:pPr>
-            <w:r>
-              <w:rPr>
-                <w:sz w:val="20"/>
-                <w:szCs w:val="20"/>
-                <w:lang w:val="es-PE"/>
-              </w:rPr>
-              <w:t>Un comprador no puede iniciar una solicitud de compra sobre un material publicado por él mismo.</w:t>
-            </w:r>
-          </w:p>
-        </w:tc>
-      </w:tr>
-      <w:tr>
-        <w:tc>
-          <w:tcPr>
-            <w:tcW w:w="1000" w:type="dxa"/>
-            <w:tcBorders>
-              <w:top w:val="single" w:sz="4" w:space="0" w:color="BFBFBF"/>
-              <w:left w:val="single" w:sz="4" w:space="0" w:color="BFBFBF"/>
-              <w:bottom w:val="single" w:sz="4" w:space="0" w:color="BFBFBF"/>
-              <w:right w:val="single" w:sz="4" w:space="0" w:color="BFBFBF"/>
-            </w:tcBorders>
-            <w:shd w:val="clear" w:color="auto" w:fill="F2F2F2"/>
-            <w:tcMar>
-              <w:top w:w="80" w:type="dxa"/>
-              <w:left w:w="120" w:type="dxa"/>
-              <w:bottom w:w="80" w:type="dxa"/>
-              <w:right w:w="120" w:type="dxa"/>
-            </w:tcMar>
-          </w:tcPr>
-          <w:p>
-            <w:r>
-              <w:rPr>
-                <w:b/>
-                <w:bCs/>
-                <w:sz w:val="20"/>
-                <w:szCs w:val="20"/>
-              </w:rPr>
-              <w:t>RN-16</w:t>
-            </w:r>
-          </w:p>
-        </w:tc>
-        <w:tc>
-          <w:tcPr>
-            <w:tcW w:w="8360" w:type="dxa"/>
-            <w:tcBorders>
-              <w:top w:val="single" w:sz="4" w:space="0" w:color="BFBFBF"/>
-              <w:left w:val="single" w:sz="4" w:space="0" w:color="BFBFBF"/>
-              <w:bottom w:val="single" w:sz="4" w:space="0" w:color="BFBFBF"/>
-              <w:right w:val="single" w:sz="4" w:space="0" w:color="BFBFBF"/>
-            </w:tcBorders>
-            <w:shd w:val="clear" w:color="auto" w:fill="F2F2F2"/>
-            <w:tcMar>
-              <w:top w:w="80" w:type="dxa"/>
-              <w:left w:w="120" w:type="dxa"/>
-              <w:bottom w:w="80" w:type="dxa"/>
-              <w:right w:w="120" w:type="dxa"/>
-            </w:tcMar>
-          </w:tcPr>
-          <w:p>
-            <w:pPr>
-              <w:rPr>
-                <w:lang w:val="es-PE"/>
-              </w:rPr>
-            </w:pPr>
-            <w:r>
-              <w:rPr>
-                <w:lang w:val="es-PE"/>
-              </w:rPr>
-              <w:t xml:space="preserve">Solo se puede realizar una </w:t>
-            </w:r>
-            <w:proofErr w:type="spellStart"/>
-            <w:r>
-              <w:rPr>
-                <w:lang w:val="es-PE"/>
-              </w:rPr>
-              <w:t>solicu</w:t>
-            </w:r>
-            <w:proofErr w:type="spellEnd"/>
-          </w:p>
-          <w:p>
-            <w:pPr>
-              <w:rPr>
-                <w:lang w:val="es-PE"/>
-              </w:rPr>
-            </w:pPr>
-            <w:proofErr w:type="spellStart"/>
-            <w:r>
-              <w:rPr>
-                <w:lang w:val="es-PE"/>
-              </w:rPr>
-              <w:t>Itud</w:t>
-            </w:r>
-            <w:proofErr w:type="spellEnd"/>
-            <w:r>
-              <w:rPr>
-                <w:lang w:val="es-PE"/>
-              </w:rPr>
-              <w:t xml:space="preserve"> por publicación</w:t>
-            </w:r>
-          </w:p>
-        </w:tc>
-      </w:tr>
-      <w:tr>
-        <w:tc>
-          <w:tcPr>
-            <w:tcW w:w="1000" w:type="dxa"/>
-            <w:tcBorders>
-              <w:top w:val="single" w:sz="4" w:space="0" w:color="BFBFBF"/>
-              <w:left w:val="single" w:sz="4" w:space="0" w:color="BFBFBF"/>
-              <w:bottom w:val="single" w:sz="4" w:space="0" w:color="BFBFBF"/>
-              <w:right w:val="single" w:sz="4" w:space="0" w:color="BFBFBF"/>
-            </w:tcBorders>
-            <w:tcMar>
-              <w:top w:w="80" w:type="dxa"/>
-              <w:left w:w="120" w:type="dxa"/>
-              <w:bottom w:w="80" w:type="dxa"/>
-              <w:right w:w="120" w:type="dxa"/>
-            </w:tcMar>
-          </w:tcPr>
-          <w:p>
-            <w:r>
-              <w:rPr>
-                <w:b/>
-                <w:bCs/>
-                <w:sz w:val="20"/>
-                <w:szCs w:val="20"/>
-              </w:rPr>
-              <w:t>RN-17</w:t>
+            <w:tcMar>
+              <w:top w:w="80" w:type="dxa"/>
+              <w:left w:w="120" w:type="dxa"/>
+              <w:bottom w:w="80" w:type="dxa"/>
+              <w:right w:w="120" w:type="dxa"/>
+            </w:tcMar>
+          </w:tcPr>
+          <w:p>
+            <w:r>
+              <w:rPr>
+                <w:b/>
+                <w:bCs/>
+                <w:sz w:val="20"/>
+                <w:szCs w:val="20"/>
+              </w:rPr>
+              <w:t>RN-1</w:t>
+            </w:r>
+            <w:r>
+              <w:rPr>
+                <w:b/>
+                <w:bCs/>
+                <w:sz w:val="20"/>
+                <w:szCs w:val="20"/>
+              </w:rPr>
+              <w:t>6</w:t>
             </w:r>
           </w:p>
         </w:tc>
@@ -4131,6 +3992,20 @@
               </w:rPr>
               <w:t>versión</w:t>
             </w:r>
+            <w:r>
+              <w:rPr>
+                <w:lang w:val="es-PE"/>
+              </w:rPr>
+              <w:t xml:space="preserve"> </w:t>
+            </w:r>
+            <w:r>
+              <w:rPr>
+                <w:sz w:val="20"/>
+                <w:szCs w:val="20"/>
+                <w:lang w:val="es-PE"/>
+              </w:rPr>
+              <w:t>150.0.7871.128</w:t>
+            </w:r>
           </w:p>
         </w:tc>
       </w:tr>
@@ -4294,6 +4169,9 @@
     </w:p>
     <w:p>
       <w:r>
+        <w:rPr>
+          <w:noProof/>
+        </w:rPr>
         <w:drawing>
           <wp:inline distT="0" distB="0" distL="0" distR="0" wp14:anchorId="1C0CE651" wp14:editId="11635E32">
             <wp:extent cx="5943600" cy="1898650"/>
@@ -4333,6 +4211,9 @@
     </w:p>
     <w:p>
       <w:r>
+        <w:rPr>
+          <w:noProof/>
+        </w:rPr>
         <w:drawing>
           <wp:inline distT="0" distB="0" distL="0" distR="0" wp14:anchorId="45CEA654" wp14:editId="14948F96">
             <wp:extent cx="5943600" cy="2010410"/>
@@ -5035,7 +4916,6 @@
   <w:style w:type="character" w:default="1" w:styleId="Fuentedeprrafopredeter">
     <w:name w:val="Default Paragraph Font"/>
     <w:uiPriority w:val="1"/>
-    <w:semiHidden/>
     <w:unhideWhenUsed/>
   </w:style>
   <w:style w:type="table" w:default="1" w:styleId="Tablanormal">

</xml_diff>